<commit_message>
Changes in Readme FE Abgabe2
</commit_message>
<xml_diff>
--- a/Frontend/Abgabe 2/Abagabe_2_Read-Me.docx
+++ b/Frontend/Abgabe 2/Abagabe_2_Read-Me.docx
@@ -17,69 +17,23 @@
           <w:bCs/>
           <w:lang w:val="en-US"/>
         </w:rPr>
-        <w:t xml:space="preserve">In Crust we </w:t>
-      </w:r>
-      <w:proofErr w:type="gramStart"/>
-      <w:r>
+        <w:t>In Crust we trust .- Pizzeria – Frontend</w:t>
+      </w:r>
+    </w:p>
+    <w:p>
+      <w:pPr>
+        <w:spacing w:after="0"/>
         <w:rPr>
           <w:b/>
           <w:bCs/>
-          <w:lang w:val="en-US"/>
         </w:rPr>
-        <w:t>trust .</w:t>
-      </w:r>
-      <w:proofErr w:type="gramEnd"/>
+      </w:pPr>
       <w:r>
         <w:rPr>
           <w:b/>
           <w:bCs/>
-          <w:lang w:val="en-US"/>
         </w:rPr>
-        <w:t>- Pizzeria – Frontend</w:t>
-      </w:r>
-    </w:p>
-    <w:p>
-      <w:pPr>
-        <w:spacing w:after="0"/>
-        <w:rPr>
-          <w:b/>
-          <w:bCs/>
-          <w:lang w:val="en-US"/>
-        </w:rPr>
-      </w:pPr>
-      <w:r>
-        <w:rPr>
-          <w:b/>
-          <w:bCs/>
-          <w:lang w:val="en-US"/>
-        </w:rPr>
-        <w:t xml:space="preserve">Frontend – </w:t>
-      </w:r>
-      <w:proofErr w:type="spellStart"/>
-      <w:r>
-        <w:rPr>
-          <w:b/>
-          <w:bCs/>
-          <w:lang w:val="en-US"/>
-        </w:rPr>
-        <w:t>Abgabe</w:t>
-      </w:r>
-      <w:proofErr w:type="spellEnd"/>
-      <w:r>
-        <w:rPr>
-          <w:b/>
-          <w:bCs/>
-          <w:lang w:val="en-US"/>
-        </w:rPr>
-        <w:t xml:space="preserve"> 2</w:t>
-      </w:r>
-      <w:r>
-        <w:rPr>
-          <w:b/>
-          <w:bCs/>
-          <w:lang w:val="en-US"/>
-        </w:rPr>
-        <w:t xml:space="preserve"> – READ ME</w:t>
+        <w:t>Frontend – Abgabe 2 – READ ME</w:t>
       </w:r>
     </w:p>
     <w:p>
@@ -90,7 +44,6 @@
           <w:bCs/>
           <w:i/>
           <w:iCs/>
-          <w:lang w:val="en-US"/>
         </w:rPr>
       </w:pPr>
     </w:p>
@@ -99,15 +52,7 @@
         <w:spacing w:after="0"/>
       </w:pPr>
       <w:r>
-        <w:t>Start immer direkt aus der IDE (</w:t>
-      </w:r>
-      <w:proofErr w:type="spellStart"/>
-      <w:r>
-        <w:t>Webstorm</w:t>
-      </w:r>
-      <w:proofErr w:type="spellEnd"/>
-      <w:r>
-        <w:t>) – index.html</w:t>
+        <w:t>Start immer direkt aus der IDE (Webstorm) – index.html</w:t>
       </w:r>
     </w:p>
     <w:p>
@@ -141,16 +86,59 @@
         <w:spacing w:after="0"/>
       </w:pPr>
       <w:r>
-        <w:t xml:space="preserve">LOGIN – ist mit dem Backend verbunden – relevante Daten werden im </w:t>
-      </w:r>
-      <w:proofErr w:type="spellStart"/>
-      <w:r>
-        <w:t>LocalSTorage</w:t>
-      </w:r>
-      <w:proofErr w:type="spellEnd"/>
-      <w:r>
-        <w:t xml:space="preserve"> gespeichert</w:t>
-      </w:r>
+        <w:t>LOGIN – ist mit dem Backend verbunden – relevante Daten werden im LocalSTorage gespeichert</w:t>
+      </w:r>
+    </w:p>
+    <w:p>
+      <w:pPr>
+        <w:spacing w:after="0"/>
+      </w:pPr>
+      <w:r>
+        <w:t>Login-Daten (noch mit Username / PW – wird auf E-Mail umgestellt)</w:t>
+      </w:r>
+    </w:p>
+    <w:p>
+      <w:pPr>
+        <w:pStyle w:val="Listenabsatz"/>
+        <w:numPr>
+          <w:ilvl w:val="0"/>
+          <w:numId w:val="2"/>
+        </w:numPr>
+        <w:spacing w:after="0"/>
+      </w:pPr>
+      <w:r>
+        <w:t>l</w:t>
+      </w:r>
+      <w:r>
+        <w:t>oganx</w:t>
+      </w:r>
+      <w:r>
+        <w:t xml:space="preserve"> / 1234 (Standarduser)</w:t>
+      </w:r>
+    </w:p>
+    <w:p>
+      <w:pPr>
+        <w:pStyle w:val="Listenabsatz"/>
+        <w:numPr>
+          <w:ilvl w:val="0"/>
+          <w:numId w:val="2"/>
+        </w:numPr>
+        <w:spacing w:after="0"/>
+      </w:pPr>
+      <w:r>
+        <w:t>p</w:t>
+      </w:r>
+      <w:r>
+        <w:t>eterb</w:t>
+      </w:r>
+      <w:r>
+        <w:t>/ 1234 (admin)</w:t>
+      </w:r>
+    </w:p>
+    <w:p>
+      <w:pPr>
+        <w:spacing w:after="0"/>
+      </w:pPr>
     </w:p>
     <w:p>
       <w:pPr>
@@ -189,52 +177,15 @@
         <w:t>Die Sichtbarkeit der</w:t>
       </w:r>
       <w:r>
-        <w:t xml:space="preserve"> Elemente der </w:t>
-      </w:r>
-      <w:proofErr w:type="spellStart"/>
-      <w:r>
-        <w:t>Navbar</w:t>
-      </w:r>
-      <w:proofErr w:type="spellEnd"/>
-      <w:r>
-        <w:t xml:space="preserve"> wird anhand von </w:t>
-      </w:r>
-      <w:proofErr w:type="spellStart"/>
-      <w:r>
-        <w:t>Userrolen</w:t>
-      </w:r>
-      <w:proofErr w:type="spellEnd"/>
-      <w:r>
-        <w:t xml:space="preserve"> und der aktuellen Seite gesteuert.</w:t>
-      </w:r>
-    </w:p>
-    <w:p>
-      <w:pPr>
-        <w:spacing w:after="0"/>
-      </w:pPr>
-      <w:proofErr w:type="gramStart"/>
-      <w:r>
-        <w:t>Bei einzelnen Seite</w:t>
-      </w:r>
-      <w:proofErr w:type="gramEnd"/>
-      <w:r>
-        <w:t xml:space="preserve"> (</w:t>
-      </w:r>
-      <w:proofErr w:type="spellStart"/>
-      <w:r>
-        <w:t>z.B</w:t>
-      </w:r>
-      <w:proofErr w:type="spellEnd"/>
-      <w:r>
-        <w:t xml:space="preserve"> orderlist.html) ist auch schon eingebaut, dass direkter Zugriff durch nicht berichtigte User über Eingabe in der Browserzeile gesperrt ist. Es erfolgt ein </w:t>
-      </w:r>
-      <w:proofErr w:type="spellStart"/>
-      <w:r>
-        <w:t>Rerouting</w:t>
-      </w:r>
-      <w:proofErr w:type="spellEnd"/>
-      <w:r>
-        <w:t xml:space="preserve"> auf menu.html</w:t>
+        <w:t xml:space="preserve"> Elemente der Navbar wird anhand von Userrolen und der aktuellen Seite gesteuert.</w:t>
+      </w:r>
+    </w:p>
+    <w:p>
+      <w:pPr>
+        <w:spacing w:after="0"/>
+      </w:pPr>
+      <w:r>
+        <w:t>Bei einzelnen Seite (z.B orderlist.html) ist auch schon eingebaut, dass direkter Zugriff durch nicht berichtigte User über Eingabe in der Browserzeile gesperrt ist. Es erfolgt ein Rerouting auf menu.html</w:t>
       </w:r>
     </w:p>
     <w:p>
@@ -270,23 +221,7 @@
         <w:spacing w:after="0"/>
       </w:pPr>
       <w:r>
-        <w:t xml:space="preserve">Die Navigation über die </w:t>
-      </w:r>
-      <w:proofErr w:type="spellStart"/>
-      <w:r>
-        <w:t>Navbar</w:t>
-      </w:r>
-      <w:proofErr w:type="spellEnd"/>
-      <w:r>
-        <w:t xml:space="preserve"> ist fast vollständige (die Badges im </w:t>
-      </w:r>
-      <w:proofErr w:type="spellStart"/>
-      <w:r>
-        <w:t>Adminbereich</w:t>
-      </w:r>
-      <w:proofErr w:type="spellEnd"/>
-      <w:r>
-        <w:t xml:space="preserve"> für neue Produkte / neue User haben noch keine Funktion).</w:t>
+        <w:t>Die Navigation über die Navbar ist fast vollständige (die Badges im Adminbereich für neue Produkte / neue User haben noch keine Funktion).</w:t>
       </w:r>
     </w:p>
     <w:p>
@@ -318,92 +253,26 @@
         <w:t xml:space="preserve">Einzelne Seiten </w:t>
       </w:r>
       <w:r>
-        <w:t xml:space="preserve">können nicht </w:t>
-      </w:r>
-      <w:proofErr w:type="spellStart"/>
-      <w:r>
-        <w:t>annavigiert</w:t>
-      </w:r>
-      <w:proofErr w:type="spellEnd"/>
-      <w:r>
-        <w:t xml:space="preserve"> werden (</w:t>
-      </w:r>
-      <w:proofErr w:type="spellStart"/>
-      <w:r>
-        <w:t>modalprofilepicture</w:t>
-      </w:r>
-      <w:proofErr w:type="spellEnd"/>
-      <w:r>
-        <w:t xml:space="preserve">, </w:t>
-      </w:r>
-      <w:proofErr w:type="spellStart"/>
-      <w:r>
-        <w:t>orderdetails</w:t>
-      </w:r>
-      <w:proofErr w:type="spellEnd"/>
-      <w:r>
-        <w:t xml:space="preserve">, </w:t>
-      </w:r>
-      <w:proofErr w:type="spellStart"/>
-      <w:r>
-        <w:t>orders</w:t>
-      </w:r>
-      <w:proofErr w:type="spellEnd"/>
-      <w:r>
-        <w:t xml:space="preserve">, </w:t>
-      </w:r>
-      <w:proofErr w:type="spellStart"/>
-      <w:proofErr w:type="gramStart"/>
-      <w:r>
-        <w:t>productinformations</w:t>
-      </w:r>
-      <w:proofErr w:type="spellEnd"/>
-      <w:r>
-        <w:t xml:space="preserve">, </w:t>
+        <w:t xml:space="preserve">können nicht annavigiert werden (modalprofilepicture, orderdetails, orders, productinformations, </w:t>
       </w:r>
       <w:r>
         <w:t xml:space="preserve"> </w:t>
       </w:r>
-      <w:proofErr w:type="spellStart"/>
-      <w:r>
-        <w:t>productinformations</w:t>
-      </w:r>
-      <w:r>
-        <w:t>Admin</w:t>
-      </w:r>
-      <w:proofErr w:type="spellEnd"/>
-      <w:proofErr w:type="gramEnd"/>
-      <w:r>
-        <w:t>). Sie sind als statische Seiten vorhanden und könne über die DIE oder direkt im Browser geöffnet werden.</w:t>
-      </w:r>
-    </w:p>
-    <w:p>
-      <w:pPr>
-        <w:spacing w:after="0"/>
-      </w:pPr>
-    </w:p>
-    <w:p>
-      <w:pPr>
-        <w:spacing w:after="0"/>
-      </w:pPr>
-      <w:r>
-        <w:t xml:space="preserve">Für </w:t>
-      </w:r>
-      <w:proofErr w:type="spellStart"/>
-      <w:r>
-        <w:t>orderlists</w:t>
-      </w:r>
-      <w:proofErr w:type="spellEnd"/>
-      <w:r>
-        <w:t xml:space="preserve"> und </w:t>
-      </w:r>
-      <w:proofErr w:type="spellStart"/>
-      <w:r>
-        <w:t>productlist</w:t>
-      </w:r>
-      <w:proofErr w:type="spellEnd"/>
-      <w:r>
-        <w:t xml:space="preserve"> werden die Daten aus dem Backende geladen – für alle anderen Seite noch nicht.</w:t>
+      <w:r>
+        <w:t>productinformationsAdmin). Sie sind als statische Seiten vorhanden und könne über die DIE oder direkt im Browser geöffnet werden.</w:t>
+      </w:r>
+    </w:p>
+    <w:p>
+      <w:pPr>
+        <w:spacing w:after="0"/>
+      </w:pPr>
+    </w:p>
+    <w:p>
+      <w:pPr>
+        <w:spacing w:after="0"/>
+      </w:pPr>
+      <w:r>
+        <w:t>Für orderlists und productlist werden die Daten aus dem Backende geladen – für alle anderen Seite noch nicht.</w:t>
       </w:r>
     </w:p>
     <w:p>
@@ -448,55 +317,28 @@
         <w:spacing w:after="0"/>
       </w:pPr>
       <w:r>
-        <w:t>Registrierung, Produkte</w:t>
-      </w:r>
-      <w:r>
-        <w:t xml:space="preserve"> (Admin)</w:t>
-      </w:r>
-      <w:r>
-        <w:t xml:space="preserve">, </w:t>
-      </w:r>
-      <w:proofErr w:type="spellStart"/>
-      <w:r>
-        <w:t>Checkout</w:t>
-      </w:r>
-      <w:proofErr w:type="spellEnd"/>
-    </w:p>
-    <w:p>
-      <w:pPr>
-        <w:spacing w:after="0"/>
-      </w:pPr>
-    </w:p>
-    <w:p>
-      <w:pPr>
-        <w:spacing w:after="0"/>
-      </w:pPr>
-      <w:r>
-        <w:t>Die Validierung erfolgt nicht über Standard-</w:t>
-      </w:r>
-      <w:proofErr w:type="gramStart"/>
-      <w:r>
-        <w:t>HTML</w:t>
-      </w:r>
-      <w:proofErr w:type="gramEnd"/>
-      <w:r>
-        <w:t xml:space="preserve"> sondern über Bootstrap.</w:t>
-      </w:r>
-    </w:p>
-    <w:p>
-      <w:pPr>
-        <w:spacing w:after="0"/>
-      </w:pPr>
-      <w:r>
-        <w:t xml:space="preserve">Sie ist zweistufig – Bei der ersten Eingabe wird erst nach dem </w:t>
-      </w:r>
-      <w:proofErr w:type="spellStart"/>
-      <w:r>
-        <w:t>Submit</w:t>
-      </w:r>
-      <w:proofErr w:type="spellEnd"/>
-      <w:r>
-        <w:t xml:space="preserve"> geprüft, danach bei jeder Eingabe in einem Formularfeld</w:t>
+        <w:t>Registrierung, Produkte (Admin), Checkout</w:t>
+      </w:r>
+    </w:p>
+    <w:p>
+      <w:pPr>
+        <w:spacing w:after="0"/>
+      </w:pPr>
+    </w:p>
+    <w:p>
+      <w:pPr>
+        <w:spacing w:after="0"/>
+      </w:pPr>
+      <w:r>
+        <w:t>Die Validierung erfolgt nicht über Standard-HTML sondern über Bootstrap.</w:t>
+      </w:r>
+    </w:p>
+    <w:p>
+      <w:pPr>
+        <w:spacing w:after="0"/>
+      </w:pPr>
+      <w:r>
+        <w:t>Sie ist zweistufig – Bei der ersten Eingabe wird erst nach dem Submit geprüft, danach bei jeder Eingabe in einem Formularfeld</w:t>
       </w:r>
     </w:p>
     <w:p>
@@ -507,28 +349,7 @@
         <w:t xml:space="preserve">Für die Validierung wurde </w:t>
       </w:r>
       <w:r>
-        <w:t xml:space="preserve">Hilfsdateien/-funktionen </w:t>
-      </w:r>
-      <w:proofErr w:type="gramStart"/>
-      <w:r>
-        <w:t>erstellt  (</w:t>
-      </w:r>
-      <w:proofErr w:type="spellStart"/>
-      <w:proofErr w:type="gramEnd"/>
-      <w:r>
-        <w:t>validation</w:t>
-      </w:r>
-      <w:proofErr w:type="spellEnd"/>
-      <w:r>
-        <w:t xml:space="preserve">, </w:t>
-      </w:r>
-      <w:proofErr w:type="spellStart"/>
-      <w:r>
-        <w:t>formUI</w:t>
-      </w:r>
-      <w:proofErr w:type="spellEnd"/>
-      <w:r>
-        <w:t>).</w:t>
+        <w:t>Hilfsdateien/-funktionen erstellt  (validation, formUI).</w:t>
       </w:r>
     </w:p>
     <w:sectPr>
@@ -656,8 +477,124 @@
       </w:rPr>
     </w:lvl>
   </w:abstractNum>
+  <w:abstractNum w:abstractNumId="1" w15:restartNumberingAfterBreak="0">
+    <w:nsid w:val="4C14719F"/>
+    <w:multiLevelType w:val="hybridMultilevel"/>
+    <w:tmpl w:val="756E5744"/>
+    <w:lvl w:ilvl="0" w:tplc="0C070001">
+      <w:start w:val="1"/>
+      <w:numFmt w:val="bullet"/>
+      <w:lvlText w:val=""/>
+      <w:lvlJc w:val="left"/>
+      <w:pPr>
+        <w:ind w:left="720" w:hanging="360"/>
+      </w:pPr>
+      <w:rPr>
+        <w:rFonts w:ascii="Symbol" w:hAnsi="Symbol" w:hint="default"/>
+      </w:rPr>
+    </w:lvl>
+    <w:lvl w:ilvl="1" w:tplc="0C070003" w:tentative="1">
+      <w:start w:val="1"/>
+      <w:numFmt w:val="bullet"/>
+      <w:lvlText w:val="o"/>
+      <w:lvlJc w:val="left"/>
+      <w:pPr>
+        <w:ind w:left="1440" w:hanging="360"/>
+      </w:pPr>
+      <w:rPr>
+        <w:rFonts w:ascii="Courier New" w:hAnsi="Courier New" w:cs="Courier New" w:hint="default"/>
+      </w:rPr>
+    </w:lvl>
+    <w:lvl w:ilvl="2" w:tplc="0C070005" w:tentative="1">
+      <w:start w:val="1"/>
+      <w:numFmt w:val="bullet"/>
+      <w:lvlText w:val=""/>
+      <w:lvlJc w:val="left"/>
+      <w:pPr>
+        <w:ind w:left="2160" w:hanging="360"/>
+      </w:pPr>
+      <w:rPr>
+        <w:rFonts w:ascii="Wingdings" w:hAnsi="Wingdings" w:hint="default"/>
+      </w:rPr>
+    </w:lvl>
+    <w:lvl w:ilvl="3" w:tplc="0C070001" w:tentative="1">
+      <w:start w:val="1"/>
+      <w:numFmt w:val="bullet"/>
+      <w:lvlText w:val=""/>
+      <w:lvlJc w:val="left"/>
+      <w:pPr>
+        <w:ind w:left="2880" w:hanging="360"/>
+      </w:pPr>
+      <w:rPr>
+        <w:rFonts w:ascii="Symbol" w:hAnsi="Symbol" w:hint="default"/>
+      </w:rPr>
+    </w:lvl>
+    <w:lvl w:ilvl="4" w:tplc="0C070003" w:tentative="1">
+      <w:start w:val="1"/>
+      <w:numFmt w:val="bullet"/>
+      <w:lvlText w:val="o"/>
+      <w:lvlJc w:val="left"/>
+      <w:pPr>
+        <w:ind w:left="3600" w:hanging="360"/>
+      </w:pPr>
+      <w:rPr>
+        <w:rFonts w:ascii="Courier New" w:hAnsi="Courier New" w:cs="Courier New" w:hint="default"/>
+      </w:rPr>
+    </w:lvl>
+    <w:lvl w:ilvl="5" w:tplc="0C070005" w:tentative="1">
+      <w:start w:val="1"/>
+      <w:numFmt w:val="bullet"/>
+      <w:lvlText w:val=""/>
+      <w:lvlJc w:val="left"/>
+      <w:pPr>
+        <w:ind w:left="4320" w:hanging="360"/>
+      </w:pPr>
+      <w:rPr>
+        <w:rFonts w:ascii="Wingdings" w:hAnsi="Wingdings" w:hint="default"/>
+      </w:rPr>
+    </w:lvl>
+    <w:lvl w:ilvl="6" w:tplc="0C070001" w:tentative="1">
+      <w:start w:val="1"/>
+      <w:numFmt w:val="bullet"/>
+      <w:lvlText w:val=""/>
+      <w:lvlJc w:val="left"/>
+      <w:pPr>
+        <w:ind w:left="5040" w:hanging="360"/>
+      </w:pPr>
+      <w:rPr>
+        <w:rFonts w:ascii="Symbol" w:hAnsi="Symbol" w:hint="default"/>
+      </w:rPr>
+    </w:lvl>
+    <w:lvl w:ilvl="7" w:tplc="0C070003" w:tentative="1">
+      <w:start w:val="1"/>
+      <w:numFmt w:val="bullet"/>
+      <w:lvlText w:val="o"/>
+      <w:lvlJc w:val="left"/>
+      <w:pPr>
+        <w:ind w:left="5760" w:hanging="360"/>
+      </w:pPr>
+      <w:rPr>
+        <w:rFonts w:ascii="Courier New" w:hAnsi="Courier New" w:cs="Courier New" w:hint="default"/>
+      </w:rPr>
+    </w:lvl>
+    <w:lvl w:ilvl="8" w:tplc="0C070005" w:tentative="1">
+      <w:start w:val="1"/>
+      <w:numFmt w:val="bullet"/>
+      <w:lvlText w:val=""/>
+      <w:lvlJc w:val="left"/>
+      <w:pPr>
+        <w:ind w:left="6480" w:hanging="360"/>
+      </w:pPr>
+      <w:rPr>
+        <w:rFonts w:ascii="Wingdings" w:hAnsi="Wingdings" w:hint="default"/>
+      </w:rPr>
+    </w:lvl>
+  </w:abstractNum>
   <w:num w:numId="1" w16cid:durableId="2038962482">
     <w:abstractNumId w:val="0"/>
+  </w:num>
+  <w:num w:numId="2" w16cid:durableId="1787314558">
+    <w:abstractNumId w:val="1"/>
   </w:num>
 </w:numbering>
 </file>

</xml_diff>